<commit_message>
Add label-free transfer calibration for coupling
</commit_message>
<xml_diff>
--- a/Project_XX_SHAP_CloudTrail_Drift/Project_Report_Draft.docx
+++ b/Project_XX_SHAP_CloudTrail_Drift/Project_Report_Draft.docx
@@ -82,7 +82,7 @@
     </w:p>
     <w:p>
       <w:r>
-        <w:t>The pipeline uses chronological train/validation/test partitions, training-only categorical maps, an Isolation Forest baseline, TreeSHAP explanation checks, feature and attribution drift metrics, validation-tuned diagnosis thresholds, protected retraining, paired statistical inference, detector/window ablations, and a separate external detector plus temporal-diagnosis track.</w:t>
+        <w:t>The pipeline uses chronological train/validation/test partitions, training-only categorical maps, an Isolation Forest baseline, TreeSHAP explanation checks, feature and attribution drift metrics, validation-tuned diagnosis thresholds, protected retraining, paired statistical inference, detector/window ablations, conservative attribution-feature coupling, and a separate external detector plus temporal-diagnosis track.</w:t>
       </w:r>
     </w:p>
     <w:p>
@@ -95,7 +95,7 @@
     </w:p>
     <w:p>
       <w:r>
-        <w:t>The controlled diagnosis benchmark achieved validation macro-F1 0.7306. In the adaptation comparison, dual-signal gating reduced false-positive rate relative to static adaptation by a paired mean difference of -0.0885 with Benjamini–Hochberg adjusted q=0.00043; its F1 difference was -0.0028 with a 95% bootstrap interval of [-0.0181, 0.0112]. On the independent labeled CloudTrail corpus, Isolation Forest achieved recall 0.7137, F1 0.4519, and false-positive rate 0.1738. These are protocol-specific results, not claims of production security effectiveness.</w:t>
+        <w:t>The controlled diagnosis benchmark achieved validation macro-F1 0.7306. In the adaptation comparison, dual-signal gating reduced false-positive rate relative to static adaptation by a paired mean difference of -0.0885 with Benjamini–Hochberg adjusted q=0.00043; its F1 difference was -0.0028 with a 95% bootstrap interval of [-0.0181, 0.0112]. On the independent labeled CloudTrail corpus, Isolation Forest achieved recall 0.7137, F1 0.4519, and false-positive rate 0.1738. A label-free largest-gap coupling calibration achieved F1 1.0000 on the small external 12-window checkpoint, while the source-tuned coupling threshold achieved F1 0.1818. These are protocol-specific results, not claims of production security effectiveness.</w:t>
       </w:r>
     </w:p>
     <w:p>
@@ -108,7 +108,7 @@
     </w:p>
     <w:p>
       <w:r>
-        <w:t>The defensible novelty is the CloudTrail-specific evaluation protocol: real unlabeled monthly observation, controlled labelled perturbations, attribution-aware diagnosis, protected adaptation, and explicit unnecessary-adaptation measurement. The paper must not claim that SHAP drift, Isolation Forest, or drift detection was invented here.</w:t>
+        <w:t>The defensible novelty is the CloudTrail-specific evaluation protocol plus an interpretable attribution-feature coupling diagnostic and separately reported label-free transfer calibration. The paper must not claim that SHAP drift, Isolation Forest, cosine similarity, or drift detection was invented here.</w:t>
       </w:r>
     </w:p>
     <w:p>
@@ -121,7 +121,7 @@
     </w:p>
     <w:p>
       <w:r>
-        <w:t>The primary corpus is unlabeled and concentrated in a small number of months/event types. The controlled benchmark is semi-synthetic. Ordinal categorical encoding may impose artificial geometry. The external temporal checkpoint is coarse, scenario-window based, and neutral across policies; full post-adaptation recovery and analyst-confirmed incident validation remain future work.</w:t>
+        <w:t>The primary corpus is unlabeled and concentrated in a small number of months/event types. The controlled benchmark is semi-synthetic. Ordinal categorical encoding may impose artificial geometry. The external temporal checkpoint is coarse and scenario-window based; the successful transfer calibration uses only 12 windows and requires larger prospective validation. Full post-adaptation recovery and analyst-confirmed incident validation remain future work.</w:t>
       </w:r>
     </w:p>
     <w:p>

</xml_diff>